<commit_message>
docs: fechamento diario v2 — pedidos do supervisor (audio)
Bloco A/B na coleta: comparecimento x matricula na hora, justificativa de
quem nao fechou, rastreio de faltas (contato/remarcacao), pos-experimental
da semana anterior, alunos antigos (cancelamento/congelamento/cobranca).

Co-Authored-By: Claude Fable 5 <noreply@anthropic.com>
</commit_message>
<xml_diff>
--- a/docs/fechamento-diario-supervisor.docx
+++ b/docs/fechamento-diario-supervisor.docx
@@ -118,7 +118,15 @@
         <w:spacing w:after="120"/>
       </w:pPr>
       <w:r>
-        <w:t xml:space="preserve">Pergunte e anote a resposta dela primeiro. Só depois abra o sistema e preencha a coluna ao lado. A ordem importa: se ela vir os números antes, a coleta não mede nada.</w:t>
+        <w:t xml:space="preserve">Esta é a base padronizada de perguntas do fechamento. Pergunte e anote a resposta dela primeiro. Só depois abra o sistema e preencha a coluna ao lado. A ordem importa: se ela vir os números antes, a coleta não mede nada.</w:t>
+      </w:r>
+    </w:p>
+    <w:p>
+      <w:pPr>
+        <w:pStyle w:val="Heading2"/>
+      </w:pPr>
+      <w:r>
+        <w:t xml:space="preserve">Bloco A — Funil e aulas de hoje</w:t>
       </w:r>
     </w:p>
     <w:tbl>
@@ -1022,7 +1030,7 @@
                 <w:sz w:val="20"/>
                 <w:szCs w:val="20"/>
               </w:rPr>
-              <w:t xml:space="preserve">7. Quantas faltas teve hoje? O que foi feito com cada uma?</w:t>
+              <w:t xml:space="preserve">7. Dos que compareceram, quantos fecharam matrícula NA HORA?</w:t>
             </w:r>
           </w:p>
         </w:tc>
@@ -1141,7 +1149,7 @@
                 <w:sz w:val="20"/>
                 <w:szCs w:val="20"/>
               </w:rPr>
-              <w:t xml:space="preserve">8. Quantas matrículas você fechou hoje?</w:t>
+              <w:t xml:space="preserve">8. Quem compareceu e NÃO fechou: qual a justificativa de CADA um? Qual o próximo passo combinado (e ele está registrado no card)?</w:t>
             </w:r>
           </w:p>
         </w:tc>
@@ -1262,7 +1270,7 @@
                 <w:sz w:val="20"/>
                 <w:szCs w:val="20"/>
               </w:rPr>
-              <w:t xml:space="preserve">9. Quantos cancelamentos / congelamentos teve hoje?</w:t>
+              <w:t xml:space="preserve">9. Quantas faltas teve hoje? TODOS os faltantes já foram contatados? Quantos remarcaram?</w:t>
             </w:r>
           </w:p>
         </w:tc>
@@ -1381,7 +1389,7 @@
                 <w:sz w:val="20"/>
                 <w:szCs w:val="20"/>
               </w:rPr>
-              <w:t xml:space="preserve">10. Quantos inadimplentes você cobrou hoje? Quantos pagamentos confirmou?</w:t>
+              <w:t xml:space="preserve">10. Quantas matrículas você fechou hoje (no total, incluindo de aulas de dias anteriores)?</w:t>
             </w:r>
           </w:p>
         </w:tc>
@@ -1479,7 +1487,7 @@
     </w:tbl>
     <w:p>
       <w:pPr>
-        <w:spacing w:after="0" w:before="120"/>
+        <w:spacing w:after="120" w:before="120"/>
       </w:pPr>
       <w:r>
         <w:rPr>
@@ -1491,6 +1499,662 @@
         <w:t xml:space="preserve">Atenção ao item de follow-ups: é o único número que o sistema não conta sozinho — só fica registrado se ela escrever a observação no diário do lead. Por isso a regra: follow sem registro = follow não feito.</w:t>
       </w:r>
     </w:p>
+    <w:p>
+      <w:pPr>
+        <w:pStyle w:val="Heading2"/>
+      </w:pPr>
+      <w:r>
+        <w:t xml:space="preserve">Bloco B — Carteira e pendências (além do dia)</w:t>
+      </w:r>
+    </w:p>
+    <w:p>
+      <w:pPr>
+        <w:spacing w:after="120"/>
+      </w:pPr>
+      <w:r>
+        <w:rPr>
+          <w:sz w:val="20"/>
+          <w:szCs w:val="20"/>
+        </w:rPr>
+        <w:t xml:space="preserve">O bloco B é onde a venda escapa sem ninguém ver: o lead que fez a aula, não fechou na hora e ninguém retomou. A pergunta 11 é a mais importante do fechamento — toda aula experimental da semana sem matrícula precisa ter dono, status e data do próximo contato.</w:t>
+      </w:r>
+    </w:p>
+    <w:tbl>
+      <w:tblPr>
+        <w:tblW w:type="dxa" w:w="9026"/>
+        <w:tblBorders>
+          <w:top w:val="single" w:color="auto" w:sz="4"/>
+          <w:left w:val="single" w:color="auto" w:sz="4"/>
+          <w:bottom w:val="single" w:color="auto" w:sz="4"/>
+          <w:right w:val="single" w:color="auto" w:sz="4"/>
+          <w:insideH w:val="single" w:color="auto" w:sz="4"/>
+          <w:insideV w:val="single" w:color="auto" w:sz="4"/>
+        </w:tblBorders>
+      </w:tblPr>
+      <w:tblGrid>
+        <w:gridCol w:w="4226"/>
+        <w:gridCol w:w="1400"/>
+        <w:gridCol w:w="1400"/>
+        <w:gridCol w:w="2000"/>
+      </w:tblGrid>
+      <w:tr>
+        <w:trPr>
+          <w:tblHeader/>
+        </w:trPr>
+        <w:tc>
+          <w:tcPr>
+            <w:tcW w:type="dxa" w:w="4226"/>
+            <w:tcBorders>
+              <w:top w:val="single" w:color="BBBBBB" w:sz="1"/>
+              <w:left w:val="single" w:color="BBBBBB" w:sz="1"/>
+              <w:bottom w:val="single" w:color="BBBBBB" w:sz="1"/>
+              <w:right w:val="single" w:color="BBBBBB" w:sz="1"/>
+            </w:tcBorders>
+            <w:shd w:fill="1F2937" w:val="clear"/>
+            <w:tcMar>
+              <w:top w:type="dxa" w:w="80"/>
+              <w:left w:type="dxa" w:w="120"/>
+              <w:bottom w:type="dxa" w:w="80"/>
+              <w:right w:type="dxa" w:w="120"/>
+            </w:tcMar>
+          </w:tcPr>
+          <w:p>
+            <w:pPr>
+              <w:spacing w:after="0"/>
+            </w:pPr>
+            <w:r>
+              <w:rPr>
+                <w:b/>
+                <w:bCs/>
+                <w:color w:val="FFFFFF"/>
+                <w:sz w:val="20"/>
+                <w:szCs w:val="20"/>
+              </w:rPr>
+              <w:t xml:space="preserve">Pergunta (fazer ANTES de abrir o sistema)</w:t>
+            </w:r>
+          </w:p>
+        </w:tc>
+        <w:tc>
+          <w:tcPr>
+            <w:tcW w:type="dxa" w:w="1400"/>
+            <w:tcBorders>
+              <w:top w:val="single" w:color="BBBBBB" w:sz="1"/>
+              <w:left w:val="single" w:color="BBBBBB" w:sz="1"/>
+              <w:bottom w:val="single" w:color="BBBBBB" w:sz="1"/>
+              <w:right w:val="single" w:color="BBBBBB" w:sz="1"/>
+            </w:tcBorders>
+            <w:shd w:fill="1F2937" w:val="clear"/>
+            <w:tcMar>
+              <w:top w:type="dxa" w:w="80"/>
+              <w:left w:type="dxa" w:w="120"/>
+              <w:bottom w:type="dxa" w:w="80"/>
+              <w:right w:type="dxa" w:w="120"/>
+            </w:tcMar>
+          </w:tcPr>
+          <w:p>
+            <w:pPr>
+              <w:spacing w:after="0"/>
+            </w:pPr>
+            <w:r>
+              <w:rPr>
+                <w:b/>
+                <w:bCs/>
+                <w:color w:val="FFFFFF"/>
+                <w:sz w:val="20"/>
+                <w:szCs w:val="20"/>
+              </w:rPr>
+              <w:t xml:space="preserve">Ela disse</w:t>
+            </w:r>
+          </w:p>
+        </w:tc>
+        <w:tc>
+          <w:tcPr>
+            <w:tcW w:type="dxa" w:w="1400"/>
+            <w:tcBorders>
+              <w:top w:val="single" w:color="BBBBBB" w:sz="1"/>
+              <w:left w:val="single" w:color="BBBBBB" w:sz="1"/>
+              <w:bottom w:val="single" w:color="BBBBBB" w:sz="1"/>
+              <w:right w:val="single" w:color="BBBBBB" w:sz="1"/>
+            </w:tcBorders>
+            <w:shd w:fill="1F2937" w:val="clear"/>
+            <w:tcMar>
+              <w:top w:type="dxa" w:w="80"/>
+              <w:left w:type="dxa" w:w="120"/>
+              <w:bottom w:type="dxa" w:w="80"/>
+              <w:right w:type="dxa" w:w="120"/>
+            </w:tcMar>
+          </w:tcPr>
+          <w:p>
+            <w:pPr>
+              <w:spacing w:after="0"/>
+            </w:pPr>
+            <w:r>
+              <w:rPr>
+                <w:b/>
+                <w:bCs/>
+                <w:color w:val="FFFFFF"/>
+                <w:sz w:val="20"/>
+                <w:szCs w:val="20"/>
+              </w:rPr>
+              <w:t xml:space="preserve">Sistema</w:t>
+            </w:r>
+          </w:p>
+        </w:tc>
+        <w:tc>
+          <w:tcPr>
+            <w:tcW w:type="dxa" w:w="2000"/>
+            <w:tcBorders>
+              <w:top w:val="single" w:color="BBBBBB" w:sz="1"/>
+              <w:left w:val="single" w:color="BBBBBB" w:sz="1"/>
+              <w:bottom w:val="single" w:color="BBBBBB" w:sz="1"/>
+              <w:right w:val="single" w:color="BBBBBB" w:sz="1"/>
+            </w:tcBorders>
+            <w:shd w:fill="1F2937" w:val="clear"/>
+            <w:tcMar>
+              <w:top w:type="dxa" w:w="80"/>
+              <w:left w:type="dxa" w:w="120"/>
+              <w:bottom w:type="dxa" w:w="80"/>
+              <w:right w:type="dxa" w:w="120"/>
+            </w:tcMar>
+          </w:tcPr>
+          <w:p>
+            <w:pPr>
+              <w:spacing w:after="0"/>
+            </w:pPr>
+            <w:r>
+              <w:rPr>
+                <w:b/>
+                <w:bCs/>
+                <w:color w:val="FFFFFF"/>
+                <w:sz w:val="20"/>
+                <w:szCs w:val="20"/>
+              </w:rPr>
+              <w:t xml:space="preserve">Bate? / Por quê?</w:t>
+            </w:r>
+          </w:p>
+        </w:tc>
+      </w:tr>
+      <w:tr>
+        <w:tc>
+          <w:tcPr>
+            <w:tcW w:type="dxa" w:w="4226"/>
+            <w:tcBorders>
+              <w:top w:val="single" w:color="BBBBBB" w:sz="1"/>
+              <w:left w:val="single" w:color="BBBBBB" w:sz="1"/>
+              <w:bottom w:val="single" w:color="BBBBBB" w:sz="1"/>
+              <w:right w:val="single" w:color="BBBBBB" w:sz="1"/>
+            </w:tcBorders>
+            <w:tcMar>
+              <w:top w:type="dxa" w:w="80"/>
+              <w:left w:type="dxa" w:w="120"/>
+              <w:bottom w:type="dxa" w:w="80"/>
+              <w:right w:type="dxa" w:w="120"/>
+            </w:tcMar>
+          </w:tcPr>
+          <w:p>
+            <w:pPr>
+              <w:spacing w:after="0"/>
+            </w:pPr>
+            <w:r>
+              <w:rPr>
+                <w:sz w:val="20"/>
+                <w:szCs w:val="20"/>
+              </w:rPr>
+              <w:t xml:space="preserve">11. Aulas experimentais da SEMANA PASSADA que ainda não viraram matrícula: qual o status de cada uma? (negociando / vai pensar / recusou — por quê? / sem retorno — quando é o próximo contato?)</w:t>
+            </w:r>
+          </w:p>
+        </w:tc>
+        <w:tc>
+          <w:tcPr>
+            <w:tcW w:type="dxa" w:w="1400"/>
+            <w:tcBorders>
+              <w:top w:val="single" w:color="BBBBBB" w:sz="1"/>
+              <w:left w:val="single" w:color="BBBBBB" w:sz="1"/>
+              <w:bottom w:val="single" w:color="BBBBBB" w:sz="1"/>
+              <w:right w:val="single" w:color="BBBBBB" w:sz="1"/>
+            </w:tcBorders>
+            <w:tcMar>
+              <w:top w:type="dxa" w:w="80"/>
+              <w:left w:type="dxa" w:w="120"/>
+              <w:bottom w:type="dxa" w:w="80"/>
+              <w:right w:type="dxa" w:w="120"/>
+            </w:tcMar>
+          </w:tcPr>
+          <w:p>
+            <w:pPr>
+              <w:spacing w:after="0"/>
+            </w:pPr>
+            <w:r>
+              <w:rPr>
+                <w:sz w:val="20"/>
+                <w:szCs w:val="20"/>
+              </w:rPr>
+              <w:t xml:space="preserve"/>
+            </w:r>
+          </w:p>
+        </w:tc>
+        <w:tc>
+          <w:tcPr>
+            <w:tcW w:type="dxa" w:w="1400"/>
+            <w:tcBorders>
+              <w:top w:val="single" w:color="BBBBBB" w:sz="1"/>
+              <w:left w:val="single" w:color="BBBBBB" w:sz="1"/>
+              <w:bottom w:val="single" w:color="BBBBBB" w:sz="1"/>
+              <w:right w:val="single" w:color="BBBBBB" w:sz="1"/>
+            </w:tcBorders>
+            <w:tcMar>
+              <w:top w:type="dxa" w:w="80"/>
+              <w:left w:type="dxa" w:w="120"/>
+              <w:bottom w:type="dxa" w:w="80"/>
+              <w:right w:type="dxa" w:w="120"/>
+            </w:tcMar>
+          </w:tcPr>
+          <w:p>
+            <w:pPr>
+              <w:spacing w:after="0"/>
+            </w:pPr>
+            <w:r>
+              <w:rPr>
+                <w:sz w:val="20"/>
+                <w:szCs w:val="20"/>
+              </w:rPr>
+              <w:t xml:space="preserve"/>
+            </w:r>
+          </w:p>
+        </w:tc>
+        <w:tc>
+          <w:tcPr>
+            <w:tcW w:type="dxa" w:w="2000"/>
+            <w:tcBorders>
+              <w:top w:val="single" w:color="BBBBBB" w:sz="1"/>
+              <w:left w:val="single" w:color="BBBBBB" w:sz="1"/>
+              <w:bottom w:val="single" w:color="BBBBBB" w:sz="1"/>
+              <w:right w:val="single" w:color="BBBBBB" w:sz="1"/>
+            </w:tcBorders>
+            <w:tcMar>
+              <w:top w:type="dxa" w:w="80"/>
+              <w:left w:type="dxa" w:w="120"/>
+              <w:bottom w:type="dxa" w:w="80"/>
+              <w:right w:type="dxa" w:w="120"/>
+            </w:tcMar>
+          </w:tcPr>
+          <w:p>
+            <w:pPr>
+              <w:spacing w:after="0"/>
+            </w:pPr>
+            <w:r>
+              <w:rPr>
+                <w:sz w:val="20"/>
+                <w:szCs w:val="20"/>
+              </w:rPr>
+              <w:t xml:space="preserve"/>
+            </w:r>
+          </w:p>
+        </w:tc>
+      </w:tr>
+      <w:tr>
+        <w:tc>
+          <w:tcPr>
+            <w:tcW w:type="dxa" w:w="4226"/>
+            <w:tcBorders>
+              <w:top w:val="single" w:color="BBBBBB" w:sz="1"/>
+              <w:left w:val="single" w:color="BBBBBB" w:sz="1"/>
+              <w:bottom w:val="single" w:color="BBBBBB" w:sz="1"/>
+              <w:right w:val="single" w:color="BBBBBB" w:sz="1"/>
+            </w:tcBorders>
+            <w:shd w:fill="F3F4F6" w:val="clear"/>
+            <w:tcMar>
+              <w:top w:type="dxa" w:w="80"/>
+              <w:left w:type="dxa" w:w="120"/>
+              <w:bottom w:type="dxa" w:w="80"/>
+              <w:right w:type="dxa" w:w="120"/>
+            </w:tcMar>
+          </w:tcPr>
+          <w:p>
+            <w:pPr>
+              <w:spacing w:after="0"/>
+            </w:pPr>
+            <w:r>
+              <w:rPr>
+                <w:sz w:val="20"/>
+                <w:szCs w:val="20"/>
+              </w:rPr>
+              <w:t xml:space="preserve">12. Quantos cancelamentos / congelamentos de alunos teve hoje? Com qual motivo?</w:t>
+            </w:r>
+          </w:p>
+        </w:tc>
+        <w:tc>
+          <w:tcPr>
+            <w:tcW w:type="dxa" w:w="1400"/>
+            <w:tcBorders>
+              <w:top w:val="single" w:color="BBBBBB" w:sz="1"/>
+              <w:left w:val="single" w:color="BBBBBB" w:sz="1"/>
+              <w:bottom w:val="single" w:color="BBBBBB" w:sz="1"/>
+              <w:right w:val="single" w:color="BBBBBB" w:sz="1"/>
+            </w:tcBorders>
+            <w:shd w:fill="F3F4F6" w:val="clear"/>
+            <w:tcMar>
+              <w:top w:type="dxa" w:w="80"/>
+              <w:left w:type="dxa" w:w="120"/>
+              <w:bottom w:type="dxa" w:w="80"/>
+              <w:right w:type="dxa" w:w="120"/>
+            </w:tcMar>
+          </w:tcPr>
+          <w:p>
+            <w:pPr>
+              <w:spacing w:after="0"/>
+            </w:pPr>
+            <w:r>
+              <w:rPr>
+                <w:sz w:val="20"/>
+                <w:szCs w:val="20"/>
+              </w:rPr>
+              <w:t xml:space="preserve"/>
+            </w:r>
+          </w:p>
+        </w:tc>
+        <w:tc>
+          <w:tcPr>
+            <w:tcW w:type="dxa" w:w="1400"/>
+            <w:tcBorders>
+              <w:top w:val="single" w:color="BBBBBB" w:sz="1"/>
+              <w:left w:val="single" w:color="BBBBBB" w:sz="1"/>
+              <w:bottom w:val="single" w:color="BBBBBB" w:sz="1"/>
+              <w:right w:val="single" w:color="BBBBBB" w:sz="1"/>
+            </w:tcBorders>
+            <w:shd w:fill="F3F4F6" w:val="clear"/>
+            <w:tcMar>
+              <w:top w:type="dxa" w:w="80"/>
+              <w:left w:type="dxa" w:w="120"/>
+              <w:bottom w:type="dxa" w:w="80"/>
+              <w:right w:type="dxa" w:w="120"/>
+            </w:tcMar>
+          </w:tcPr>
+          <w:p>
+            <w:pPr>
+              <w:spacing w:after="0"/>
+            </w:pPr>
+            <w:r>
+              <w:rPr>
+                <w:sz w:val="20"/>
+                <w:szCs w:val="20"/>
+              </w:rPr>
+              <w:t xml:space="preserve"/>
+            </w:r>
+          </w:p>
+        </w:tc>
+        <w:tc>
+          <w:tcPr>
+            <w:tcW w:type="dxa" w:w="2000"/>
+            <w:tcBorders>
+              <w:top w:val="single" w:color="BBBBBB" w:sz="1"/>
+              <w:left w:val="single" w:color="BBBBBB" w:sz="1"/>
+              <w:bottom w:val="single" w:color="BBBBBB" w:sz="1"/>
+              <w:right w:val="single" w:color="BBBBBB" w:sz="1"/>
+            </w:tcBorders>
+            <w:shd w:fill="F3F4F6" w:val="clear"/>
+            <w:tcMar>
+              <w:top w:type="dxa" w:w="80"/>
+              <w:left w:type="dxa" w:w="120"/>
+              <w:bottom w:type="dxa" w:w="80"/>
+              <w:right w:type="dxa" w:w="120"/>
+            </w:tcMar>
+          </w:tcPr>
+          <w:p>
+            <w:pPr>
+              <w:spacing w:after="0"/>
+            </w:pPr>
+            <w:r>
+              <w:rPr>
+                <w:sz w:val="20"/>
+                <w:szCs w:val="20"/>
+              </w:rPr>
+              <w:t xml:space="preserve"/>
+            </w:r>
+          </w:p>
+        </w:tc>
+      </w:tr>
+      <w:tr>
+        <w:tc>
+          <w:tcPr>
+            <w:tcW w:type="dxa" w:w="4226"/>
+            <w:tcBorders>
+              <w:top w:val="single" w:color="BBBBBB" w:sz="1"/>
+              <w:left w:val="single" w:color="BBBBBB" w:sz="1"/>
+              <w:bottom w:val="single" w:color="BBBBBB" w:sz="1"/>
+              <w:right w:val="single" w:color="BBBBBB" w:sz="1"/>
+            </w:tcBorders>
+            <w:tcMar>
+              <w:top w:type="dxa" w:w="80"/>
+              <w:left w:type="dxa" w:w="120"/>
+              <w:bottom w:type="dxa" w:w="80"/>
+              <w:right w:type="dxa" w:w="120"/>
+            </w:tcMar>
+          </w:tcPr>
+          <w:p>
+            <w:pPr>
+              <w:spacing w:after="0"/>
+            </w:pPr>
+            <w:r>
+              <w:rPr>
+                <w:sz w:val="20"/>
+                <w:szCs w:val="20"/>
+              </w:rPr>
+              <w:t xml:space="preserve">13. Quantos inadimplentes você cobrou hoje? Quantos pagamentos confirmou no sistema?</w:t>
+            </w:r>
+          </w:p>
+        </w:tc>
+        <w:tc>
+          <w:tcPr>
+            <w:tcW w:type="dxa" w:w="1400"/>
+            <w:tcBorders>
+              <w:top w:val="single" w:color="BBBBBB" w:sz="1"/>
+              <w:left w:val="single" w:color="BBBBBB" w:sz="1"/>
+              <w:bottom w:val="single" w:color="BBBBBB" w:sz="1"/>
+              <w:right w:val="single" w:color="BBBBBB" w:sz="1"/>
+            </w:tcBorders>
+            <w:tcMar>
+              <w:top w:type="dxa" w:w="80"/>
+              <w:left w:type="dxa" w:w="120"/>
+              <w:bottom w:type="dxa" w:w="80"/>
+              <w:right w:type="dxa" w:w="120"/>
+            </w:tcMar>
+          </w:tcPr>
+          <w:p>
+            <w:pPr>
+              <w:spacing w:after="0"/>
+            </w:pPr>
+            <w:r>
+              <w:rPr>
+                <w:sz w:val="20"/>
+                <w:szCs w:val="20"/>
+              </w:rPr>
+              <w:t xml:space="preserve"/>
+            </w:r>
+          </w:p>
+        </w:tc>
+        <w:tc>
+          <w:tcPr>
+            <w:tcW w:type="dxa" w:w="1400"/>
+            <w:tcBorders>
+              <w:top w:val="single" w:color="BBBBBB" w:sz="1"/>
+              <w:left w:val="single" w:color="BBBBBB" w:sz="1"/>
+              <w:bottom w:val="single" w:color="BBBBBB" w:sz="1"/>
+              <w:right w:val="single" w:color="BBBBBB" w:sz="1"/>
+            </w:tcBorders>
+            <w:tcMar>
+              <w:top w:type="dxa" w:w="80"/>
+              <w:left w:type="dxa" w:w="120"/>
+              <w:bottom w:type="dxa" w:w="80"/>
+              <w:right w:type="dxa" w:w="120"/>
+            </w:tcMar>
+          </w:tcPr>
+          <w:p>
+            <w:pPr>
+              <w:spacing w:after="0"/>
+            </w:pPr>
+            <w:r>
+              <w:rPr>
+                <w:sz w:val="20"/>
+                <w:szCs w:val="20"/>
+              </w:rPr>
+              <w:t xml:space="preserve"/>
+            </w:r>
+          </w:p>
+        </w:tc>
+        <w:tc>
+          <w:tcPr>
+            <w:tcW w:type="dxa" w:w="2000"/>
+            <w:tcBorders>
+              <w:top w:val="single" w:color="BBBBBB" w:sz="1"/>
+              <w:left w:val="single" w:color="BBBBBB" w:sz="1"/>
+              <w:bottom w:val="single" w:color="BBBBBB" w:sz="1"/>
+              <w:right w:val="single" w:color="BBBBBB" w:sz="1"/>
+            </w:tcBorders>
+            <w:tcMar>
+              <w:top w:type="dxa" w:w="80"/>
+              <w:left w:type="dxa" w:w="120"/>
+              <w:bottom w:type="dxa" w:w="80"/>
+              <w:right w:type="dxa" w:w="120"/>
+            </w:tcMar>
+          </w:tcPr>
+          <w:p>
+            <w:pPr>
+              <w:spacing w:after="0"/>
+            </w:pPr>
+            <w:r>
+              <w:rPr>
+                <w:sz w:val="20"/>
+                <w:szCs w:val="20"/>
+              </w:rPr>
+              <w:t xml:space="preserve"/>
+            </w:r>
+          </w:p>
+        </w:tc>
+      </w:tr>
+      <w:tr>
+        <w:tc>
+          <w:tcPr>
+            <w:tcW w:type="dxa" w:w="4226"/>
+            <w:tcBorders>
+              <w:top w:val="single" w:color="BBBBBB" w:sz="1"/>
+              <w:left w:val="single" w:color="BBBBBB" w:sz="1"/>
+              <w:bottom w:val="single" w:color="BBBBBB" w:sz="1"/>
+              <w:right w:val="single" w:color="BBBBBB" w:sz="1"/>
+            </w:tcBorders>
+            <w:shd w:fill="F3F4F6" w:val="clear"/>
+            <w:tcMar>
+              <w:top w:type="dxa" w:w="80"/>
+              <w:left w:type="dxa" w:w="120"/>
+              <w:bottom w:type="dxa" w:w="80"/>
+              <w:right w:type="dxa" w:w="120"/>
+            </w:tcMar>
+          </w:tcPr>
+          <w:p>
+            <w:pPr>
+              <w:spacing w:after="0"/>
+            </w:pPr>
+            <w:r>
+              <w:rPr>
+                <w:sz w:val="20"/>
+                <w:szCs w:val="20"/>
+              </w:rPr>
+              <w:t xml:space="preserve">14. Algum aluno antigo sinalizou que quer sair / sumiu das aulas / pediu congelamento? O que foi combinado?</w:t>
+            </w:r>
+          </w:p>
+        </w:tc>
+        <w:tc>
+          <w:tcPr>
+            <w:tcW w:type="dxa" w:w="1400"/>
+            <w:tcBorders>
+              <w:top w:val="single" w:color="BBBBBB" w:sz="1"/>
+              <w:left w:val="single" w:color="BBBBBB" w:sz="1"/>
+              <w:bottom w:val="single" w:color="BBBBBB" w:sz="1"/>
+              <w:right w:val="single" w:color="BBBBBB" w:sz="1"/>
+            </w:tcBorders>
+            <w:shd w:fill="F3F4F6" w:val="clear"/>
+            <w:tcMar>
+              <w:top w:type="dxa" w:w="80"/>
+              <w:left w:type="dxa" w:w="120"/>
+              <w:bottom w:type="dxa" w:w="80"/>
+              <w:right w:type="dxa" w:w="120"/>
+            </w:tcMar>
+          </w:tcPr>
+          <w:p>
+            <w:pPr>
+              <w:spacing w:after="0"/>
+            </w:pPr>
+            <w:r>
+              <w:rPr>
+                <w:sz w:val="20"/>
+                <w:szCs w:val="20"/>
+              </w:rPr>
+              <w:t xml:space="preserve"/>
+            </w:r>
+          </w:p>
+        </w:tc>
+        <w:tc>
+          <w:tcPr>
+            <w:tcW w:type="dxa" w:w="1400"/>
+            <w:tcBorders>
+              <w:top w:val="single" w:color="BBBBBB" w:sz="1"/>
+              <w:left w:val="single" w:color="BBBBBB" w:sz="1"/>
+              <w:bottom w:val="single" w:color="BBBBBB" w:sz="1"/>
+              <w:right w:val="single" w:color="BBBBBB" w:sz="1"/>
+            </w:tcBorders>
+            <w:shd w:fill="F3F4F6" w:val="clear"/>
+            <w:tcMar>
+              <w:top w:type="dxa" w:w="80"/>
+              <w:left w:type="dxa" w:w="120"/>
+              <w:bottom w:type="dxa" w:w="80"/>
+              <w:right w:type="dxa" w:w="120"/>
+            </w:tcMar>
+          </w:tcPr>
+          <w:p>
+            <w:pPr>
+              <w:spacing w:after="0"/>
+            </w:pPr>
+            <w:r>
+              <w:rPr>
+                <w:sz w:val="20"/>
+                <w:szCs w:val="20"/>
+              </w:rPr>
+              <w:t xml:space="preserve"/>
+            </w:r>
+          </w:p>
+        </w:tc>
+        <w:tc>
+          <w:tcPr>
+            <w:tcW w:type="dxa" w:w="2000"/>
+            <w:tcBorders>
+              <w:top w:val="single" w:color="BBBBBB" w:sz="1"/>
+              <w:left w:val="single" w:color="BBBBBB" w:sz="1"/>
+              <w:bottom w:val="single" w:color="BBBBBB" w:sz="1"/>
+              <w:right w:val="single" w:color="BBBBBB" w:sz="1"/>
+            </w:tcBorders>
+            <w:shd w:fill="F3F4F6" w:val="clear"/>
+            <w:tcMar>
+              <w:top w:type="dxa" w:w="80"/>
+              <w:left w:type="dxa" w:w="120"/>
+              <w:bottom w:type="dxa" w:w="80"/>
+              <w:right w:type="dxa" w:w="120"/>
+            </w:tcMar>
+          </w:tcPr>
+          <w:p>
+            <w:pPr>
+              <w:spacing w:after="0"/>
+            </w:pPr>
+            <w:r>
+              <w:rPr>
+                <w:sz w:val="20"/>
+                <w:szCs w:val="20"/>
+              </w:rPr>
+              <w:t xml:space="preserve"/>
+            </w:r>
+          </w:p>
+        </w:tc>
+      </w:tr>
+    </w:tbl>
     <w:p>
       <w:pPr>
         <w:pStyle w:val="Heading1"/>
@@ -2074,6 +2738,132 @@
                 <w:sz w:val="20"/>
                 <w:szCs w:val="20"/>
               </w:rPr>
+              <w:t xml:space="preserve">Compareceu e NÃO fechou</w:t>
+            </w:r>
+          </w:p>
+        </w:tc>
+        <w:tc>
+          <w:tcPr>
+            <w:tcW w:type="dxa" w:w="6026"/>
+            <w:tcBorders>
+              <w:top w:val="single" w:color="BBBBBB" w:sz="1"/>
+              <w:left w:val="single" w:color="BBBBBB" w:sz="1"/>
+              <w:bottom w:val="single" w:color="BBBBBB" w:sz="1"/>
+              <w:right w:val="single" w:color="BBBBBB" w:sz="1"/>
+            </w:tcBorders>
+            <w:shd w:fill="F3F4F6" w:val="clear"/>
+            <w:tcMar>
+              <w:top w:type="dxa" w:w="80"/>
+              <w:left w:type="dxa" w:w="120"/>
+              <w:bottom w:type="dxa" w:w="80"/>
+              <w:right w:type="dxa" w:w="120"/>
+            </w:tcMar>
+          </w:tcPr>
+          <w:p>
+            <w:pPr>
+              <w:spacing w:after="0"/>
+            </w:pPr>
+            <w:r>
+              <w:rPr>
+                <w:sz w:val="20"/>
+                <w:szCs w:val="20"/>
+              </w:rPr>
+              <w:t xml:space="preserve">Agenda (visão dia) → aulas VERDES de hoje. Pra cada uma, abrir o card do lead no kanban: tem matrícula? Se não tem, a justificativa + próximo passo devem estar no diário do lead.</w:t>
+            </w:r>
+          </w:p>
+        </w:tc>
+      </w:tr>
+      <w:tr>
+        <w:tc>
+          <w:tcPr>
+            <w:tcW w:type="dxa" w:w="3000"/>
+            <w:tcBorders>
+              <w:top w:val="single" w:color="BBBBBB" w:sz="1"/>
+              <w:left w:val="single" w:color="BBBBBB" w:sz="1"/>
+              <w:bottom w:val="single" w:color="BBBBBB" w:sz="1"/>
+              <w:right w:val="single" w:color="BBBBBB" w:sz="1"/>
+            </w:tcBorders>
+            <w:tcMar>
+              <w:top w:type="dxa" w:w="80"/>
+              <w:left w:type="dxa" w:w="120"/>
+              <w:bottom w:type="dxa" w:w="80"/>
+              <w:right w:type="dxa" w:w="120"/>
+            </w:tcMar>
+          </w:tcPr>
+          <w:p>
+            <w:pPr>
+              <w:spacing w:after="0"/>
+            </w:pPr>
+            <w:r>
+              <w:rPr>
+                <w:b/>
+                <w:bCs/>
+                <w:sz w:val="20"/>
+                <w:szCs w:val="20"/>
+              </w:rPr>
+              <w:t xml:space="preserve">Pós-experimental da semana passada</w:t>
+            </w:r>
+          </w:p>
+        </w:tc>
+        <w:tc>
+          <w:tcPr>
+            <w:tcW w:type="dxa" w:w="6026"/>
+            <w:tcBorders>
+              <w:top w:val="single" w:color="BBBBBB" w:sz="1"/>
+              <w:left w:val="single" w:color="BBBBBB" w:sz="1"/>
+              <w:bottom w:val="single" w:color="BBBBBB" w:sz="1"/>
+              <w:right w:val="single" w:color="BBBBBB" w:sz="1"/>
+            </w:tcBorders>
+            <w:tcMar>
+              <w:top w:type="dxa" w:w="80"/>
+              <w:left w:type="dxa" w:w="120"/>
+              <w:bottom w:type="dxa" w:w="80"/>
+              <w:right w:type="dxa" w:w="120"/>
+            </w:tcMar>
+          </w:tcPr>
+          <w:p>
+            <w:pPr>
+              <w:spacing w:after="0"/>
+            </w:pPr>
+            <w:r>
+              <w:rPr>
+                <w:sz w:val="20"/>
+                <w:szCs w:val="20"/>
+              </w:rPr>
+              <w:t xml:space="preserve">Agenda → voltar 1 semana (visão semana) → aulas VERDES. Cruzar com o kanban: quem ainda não está em “Matriculado” é pendência viva — status e próximo contato devem estar no diário.</w:t>
+            </w:r>
+          </w:p>
+        </w:tc>
+      </w:tr>
+      <w:tr>
+        <w:tc>
+          <w:tcPr>
+            <w:tcW w:type="dxa" w:w="3000"/>
+            <w:tcBorders>
+              <w:top w:val="single" w:color="BBBBBB" w:sz="1"/>
+              <w:left w:val="single" w:color="BBBBBB" w:sz="1"/>
+              <w:bottom w:val="single" w:color="BBBBBB" w:sz="1"/>
+              <w:right w:val="single" w:color="BBBBBB" w:sz="1"/>
+            </w:tcBorders>
+            <w:shd w:fill="F3F4F6" w:val="clear"/>
+            <w:tcMar>
+              <w:top w:type="dxa" w:w="80"/>
+              <w:left w:type="dxa" w:w="120"/>
+              <w:bottom w:type="dxa" w:w="80"/>
+              <w:right w:type="dxa" w:w="120"/>
+            </w:tcMar>
+          </w:tcPr>
+          <w:p>
+            <w:pPr>
+              <w:spacing w:after="0"/>
+            </w:pPr>
+            <w:r>
+              <w:rPr>
+                <w:b/>
+                <w:bCs/>
+                <w:sz w:val="20"/>
+                <w:szCs w:val="20"/>
+              </w:rPr>
               <w:t xml:space="preserve">Cancelamentos / congelamentos</w:t>
             </w:r>
           </w:p>
@@ -2104,7 +2894,7 @@
                 <w:sz w:val="20"/>
                 <w:szCs w:val="20"/>
               </w:rPr>
-              <w:t xml:space="preserve">Tela Matrículas → filtro de status “Cancelada” / “Congelada”.</w:t>
+              <w:t xml:space="preserve">Tela Matrículas → filtro de status “Cancelada” / “Congelada” (congeladas mostram a data prevista de retorno).</w:t>
             </w:r>
           </w:p>
         </w:tc>
@@ -2357,6 +3147,52 @@
       </w:r>
       <w:r>
         <w:t xml:space="preserve"> (não genérico tipo “sem interesse” sem contexto).</w:t>
+      </w:r>
+    </w:p>
+    <w:p>
+      <w:pPr>
+        <w:pStyle w:val="ListParagraph"/>
+        <w:numPr>
+          <w:ilvl w:val="0"/>
+          <w:numId w:val="2"/>
+        </w:numPr>
+        <w:spacing w:after="60"/>
+      </w:pPr>
+      <w:r>
+        <w:t xml:space="preserve">Todo </w:t>
+      </w:r>
+      <w:r>
+        <w:rPr>
+          <w:b/>
+          <w:bCs/>
+        </w:rPr>
+        <w:t xml:space="preserve">comparecimento sem matrícula</w:t>
+      </w:r>
+      <w:r>
+        <w:t xml:space="preserve"> (de hoje e da semana) tem justificativa + próximo passo registrados no diário do lead.</w:t>
+      </w:r>
+    </w:p>
+    <w:p>
+      <w:pPr>
+        <w:pStyle w:val="ListParagraph"/>
+        <w:numPr>
+          <w:ilvl w:val="0"/>
+          <w:numId w:val="2"/>
+        </w:numPr>
+        <w:spacing w:after="60"/>
+      </w:pPr>
+      <w:r>
+        <w:t xml:space="preserve">Alunos </w:t>
+      </w:r>
+      <w:r>
+        <w:rPr>
+          <w:b/>
+          <w:bCs/>
+        </w:rPr>
+        <w:t xml:space="preserve">congelados com data de retorno vencida</w:t>
+      </w:r>
+      <w:r>
+        <w:t xml:space="preserve"> revisados — voltou? estende? cancela?</w:t>
       </w:r>
     </w:p>
     <w:p>

</xml_diff>